<commit_message>
Update company card to T-Bank details
</commit_message>
<xml_diff>
--- a/public/documents/company-card-ip-keshtova.docx
+++ b/public/documents/company-card-ip-keshtova.docx
@@ -541,7 +541,7 @@
                 <w:color w:val="000000"/>
                 <w:sz w:val="19"/>
               </w:rPr>
-              <w:t>40802810300810112690</w:t>
+              <w:t>40802810200006310115</w:t>
             </w:r>
           </w:p>
         </w:tc>
@@ -612,7 +612,7 @@
                 <w:color w:val="000000"/>
                 <w:sz w:val="19"/>
               </w:rPr>
-              <w:t>Филиал «Центральный» Банка ВТБ (ПАО) в г. Москве</w:t>
+              <w:t>АО «ТБанк»</w:t>
             </w:r>
           </w:p>
         </w:tc>
@@ -681,7 +681,7 @@
                 <w:color w:val="000000"/>
                 <w:sz w:val="19"/>
               </w:rPr>
-              <w:t>044525411</w:t>
+              <w:t>044525974</w:t>
             </w:r>
           </w:p>
         </w:tc>
@@ -752,7 +752,7 @@
                 <w:color w:val="000000"/>
                 <w:sz w:val="19"/>
               </w:rPr>
-              <w:t>30101810145250000411</w:t>
+              <w:t>30101810145250000974</w:t>
             </w:r>
           </w:p>
         </w:tc>

</xml_diff>